<commit_message>
docs(kinetik): render RFC mermaid diagrams to PNG and embed in DOCX
rfc-002/003 DOCX previously had mermaid as literal code blocks; now each diagram
is pre-rendered (mmdc) and embedded as an image before the pandoc conversion.
</commit_message>
<xml_diff>
--- a/docs/kinetik/rfc-002-as-is.docx
+++ b/docs/kinetik/rfc-002-as-is.docx
@@ -28,7 +28,7 @@
         </w:p>
       </w:sdtContent>
     </w:sdt>
-    <w:bookmarkStart w:id="25" w:name="X16bc387402d1f824e7227a4341cdcf75abf8279"/>
+    <w:bookmarkStart w:id="31" w:name="X16bc387402d1f824e7227a4341cdcf75abf8279"/>
     <w:p>
       <w:pPr>
         <w:pStyle w:val="Heading1"/>
@@ -417,7 +417,7 @@
       </w:r>
     </w:p>
     <w:bookmarkEnd w:id="9"/>
-    <w:bookmarkStart w:id="13" w:name="X303a6e5149c31cc8947ff5b54676821bc6a5868"/>
+    <w:bookmarkStart w:id="16" w:name="X303a6e5149c31cc8947ff5b54676821bc6a5868"/>
     <w:p>
       <w:pPr>
         <w:pStyle w:val="Heading2"/>
@@ -476,7 +476,7 @@
         <w:t xml:space="preserve">.</w:t>
       </w:r>
     </w:p>
-    <w:bookmarkStart w:id="10" w:name="rantai-dokumen"/>
+    <w:bookmarkStart w:id="13" w:name="rantai-dokumen"/>
     <w:p>
       <w:pPr>
         <w:pStyle w:val="Heading3"/>
@@ -487,58 +487,49 @@
     </w:p>
     <w:p>
       <w:pPr>
-        <w:pStyle w:val="SourceCode"/>
-      </w:pPr>
-      <w:r>
-        <w:rPr>
-          <w:rStyle w:val="VerbatimChar"/>
-        </w:rPr>
-        <w:t xml:space="preserve">flowchart TD</w:t>
-      </w:r>
-      <w:r>
-        <w:br/>
-      </w:r>
-      <w:r>
-        <w:rPr>
-          <w:rStyle w:val="VerbatimChar"/>
-        </w:rPr>
-        <w:t xml:space="preserve">  ANG["Anggota"] --&gt;|isi tiap minggu| KMA["Kegiatan Mingguan Anggota.xlsx\n(1 sheet per tim · Target/Realisasi/Capaian/Kendala)"]</w:t>
-      </w:r>
-      <w:r>
-        <w:br/>
-      </w:r>
-      <w:r>
-        <w:rPr>
-          <w:rStyle w:val="VerbatimChar"/>
-        </w:rPr>
-        <w:t xml:space="preserve">  KMA --&gt;|PJ merangkum| RM["Rapat mingguan.xlsx\n(per tim→projek + Notula/Dokumentasi/Daftar Hadir)"]</w:t>
-      </w:r>
-      <w:r>
-        <w:br/>
-      </w:r>
-      <w:r>
-        <w:rPr>
-          <w:rStyle w:val="VerbatimChar"/>
-        </w:rPr>
-        <w:t xml:space="preserve">  RM --&gt;|RAPAT MINGGUAN dgn PJ| RM</w:t>
-      </w:r>
-      <w:r>
-        <w:br/>
-      </w:r>
-      <w:r>
-        <w:rPr>
-          <w:rStyle w:val="VerbatimChar"/>
-        </w:rPr>
-        <w:t xml:space="preserve">  RM --&gt;|akumulasi 4–5 minggu, diparafrase| RB["260130 Rapat Bulanan.xlsx\n(per bulan · Kendala/Solusi/RTL diparafrase)"]</w:t>
-      </w:r>
-      <w:r>
-        <w:br/>
-      </w:r>
-      <w:r>
-        <w:rPr>
-          <w:rStyle w:val="VerbatimChar"/>
-        </w:rPr>
-        <w:t xml:space="preserve">  RB --&gt;|RAPAT BULANAN dgn Kepala Kantor| KK["Kepala Kantor\n(Pak Daryanto)"]</w:t>
+        <w:pStyle w:val="FirstParagraph"/>
+      </w:pPr>
+      <w:r>
+        <w:drawing>
+          <wp:inline>
+            <wp:extent cx="5334000" cy="8865548"/>
+            <wp:effectExtent b="0" l="0" r="0" t="0"/>
+            <wp:docPr descr="" title="" id="11" name="Picture"/>
+            <a:graphic>
+              <a:graphicData uri="http://schemas.openxmlformats.org/drawingml/2006/picture">
+                <pic:pic>
+                  <pic:nvPicPr>
+                    <pic:cNvPr descr="diagrams/rfc-002-as-is-1.png" id="12" name="Picture"/>
+                    <pic:cNvPicPr>
+                      <a:picLocks noChangeArrowheads="1" noChangeAspect="1"/>
+                    </pic:cNvPicPr>
+                  </pic:nvPicPr>
+                  <pic:blipFill>
+                    <a:blip r:embed="rId10"/>
+                    <a:stretch>
+                      <a:fillRect/>
+                    </a:stretch>
+                  </pic:blipFill>
+                  <pic:spPr bwMode="auto">
+                    <a:xfrm>
+                      <a:off x="0" y="0"/>
+                      <a:ext cx="5334000" cy="8865548"/>
+                    </a:xfrm>
+                    <a:prstGeom prst="rect">
+                      <a:avLst/>
+                    </a:prstGeom>
+                    <a:noFill/>
+                    <a:ln w="9525">
+                      <a:noFill/>
+                      <a:headEnd/>
+                      <a:tailEnd/>
+                    </a:ln>
+                  </pic:spPr>
+                </pic:pic>
+              </a:graphicData>
+            </a:graphic>
+          </wp:inline>
+        </w:drawing>
       </w:r>
     </w:p>
     <w:p>
@@ -616,8 +607,8 @@
         <w:t xml:space="preserve">(parafrase RB).</w:t>
       </w:r>
     </w:p>
-    <w:bookmarkEnd w:id="10"/>
-    <w:bookmarkStart w:id="11" w:name="X6917ed2db1b39cf82daed281c9d56fe33656bac"/>
+    <w:bookmarkEnd w:id="13"/>
+    <w:bookmarkStart w:id="14" w:name="X6917ed2db1b39cf82daed281c9d56fe33656bac"/>
     <w:p>
       <w:pPr>
         <w:pStyle w:val="Heading3"/>
@@ -1199,8 +1190,8 @@
         <w:t xml:space="preserve">manual yang ingin dihilangkan aplikasi.</w:t>
       </w:r>
     </w:p>
-    <w:bookmarkEnd w:id="11"/>
-    <w:bookmarkStart w:id="12" w:name="X3e50b0b3afe96018a91082c00c207b05e684032"/>
+    <w:bookmarkEnd w:id="14"/>
+    <w:bookmarkStart w:id="15" w:name="X3e50b0b3afe96018a91082c00c207b05e684032"/>
     <w:p>
       <w:pPr>
         <w:pStyle w:val="Heading3"/>
@@ -1380,9 +1371,9 @@
         </w:pict>
       </w:r>
     </w:p>
-    <w:bookmarkEnd w:id="12"/>
-    <w:bookmarkEnd w:id="13"/>
-    <w:bookmarkStart w:id="18" w:name="dunia-aplikasi-apa-yang-sudah-dibangun"/>
+    <w:bookmarkEnd w:id="15"/>
+    <w:bookmarkEnd w:id="16"/>
+    <w:bookmarkStart w:id="24" w:name="dunia-aplikasi-apa-yang-sudah-dibangun"/>
     <w:p>
       <w:pPr>
         <w:pStyle w:val="Heading2"/>
@@ -1432,7 +1423,7 @@
         <w:t xml:space="preserve">). Dua domain hidup di satu codebase:</w:t>
       </w:r>
     </w:p>
-    <w:bookmarkStart w:id="14" w:name="X3575543485733b52ae61ec3c27ef95904936247"/>
+    <w:bookmarkStart w:id="17" w:name="X3575543485733b52ae61ec3c27ef95904936247"/>
     <w:p>
       <w:pPr>
         <w:pStyle w:val="Heading3"/>
@@ -1566,8 +1557,8 @@
         <w:t xml:space="preserve">).</w:t>
       </w:r>
     </w:p>
-    <w:bookmarkEnd w:id="14"/>
-    <w:bookmarkStart w:id="15" w:name="a-arsitektur-nyata-hari-ini"/>
+    <w:bookmarkEnd w:id="17"/>
+    <w:bookmarkStart w:id="21" w:name="a-arsitektur-nyata-hari-ini"/>
     <w:p>
       <w:pPr>
         <w:pStyle w:val="Heading3"/>
@@ -1578,130 +1569,49 @@
     </w:p>
     <w:p>
       <w:pPr>
-        <w:pStyle w:val="SourceCode"/>
-      </w:pPr>
-      <w:r>
-        <w:rPr>
-          <w:rStyle w:val="VerbatimChar"/>
-        </w:rPr>
-        <w:t xml:space="preserve">flowchart LR</w:t>
-      </w:r>
-      <w:r>
-        <w:br/>
-      </w:r>
-      <w:r>
-        <w:rPr>
-          <w:rStyle w:val="VerbatimChar"/>
-        </w:rPr>
-        <w:t xml:space="preserve">  ADM["Admin"] --&gt;|tempel token sesi| CRED[("kip_credentials\n(token terenkripsi)")]</w:t>
-      </w:r>
-      <w:r>
-        <w:br/>
-      </w:r>
-      <w:r>
-        <w:rPr>
-          <w:rStyle w:val="VerbatimChar"/>
-        </w:rPr>
-        <w:t xml:space="preserve">  ADM --&gt;|Sinkronkan Semua| SYNC</w:t>
-      </w:r>
-      <w:r>
-        <w:br/>
-      </w:r>
-      <w:r>
-        <w:rPr>
-          <w:rStyle w:val="VerbatimChar"/>
-        </w:rPr>
-        <w:t xml:space="preserve">  CRON(("Cron MINGGUAN\nSenin 05:00")) --&gt; SYNC</w:t>
-      </w:r>
-      <w:r>
-        <w:br/>
-      </w:r>
-      <w:r>
-        <w:rPr>
-          <w:rStyle w:val="VerbatimChar"/>
-        </w:rPr>
-        <w:t xml:space="preserve">  CRED --&gt; AUTH["ConfigBearerAuthenticator\n(x-auth Bearer)"]</w:t>
-      </w:r>
-      <w:r>
-        <w:br/>
-      </w:r>
-      <w:r>
-        <w:rPr>
-          <w:rStyle w:val="VerbatimChar"/>
-        </w:rPr>
-        <w:t xml:space="preserve">  AUTH --&gt; SYNC["SyncKipActivitiesAction\n+ ApiKipActivitySource (2-langkah)"]</w:t>
-      </w:r>
-      <w:r>
-        <w:br/>
-      </w:r>
-      <w:r>
-        <w:rPr>
-          <w:rStyle w:val="VerbatimChar"/>
-        </w:rPr>
-        <w:t xml:space="preserve">  KIP[/"kipApp /v1\n(endpoint hasil inspeksi)"/] --&gt; SYNC</w:t>
-      </w:r>
-      <w:r>
-        <w:br/>
-      </w:r>
-      <w:r>
-        <w:rPr>
-          <w:rStyle w:val="VerbatimChar"/>
-        </w:rPr>
-        <w:t xml:space="preserve">  SYNC --&gt;|upsert by external_id| KA[("kip_activities")]</w:t>
-      </w:r>
-      <w:r>
-        <w:br/>
-      </w:r>
-      <w:r>
-        <w:rPr>
-          <w:rStyle w:val="VerbatimChar"/>
-        </w:rPr>
-        <w:t xml:space="preserve">  ANG["Anggota"] --&gt;|claim + Target/Realisasi/Kendala/Solusi/RTL| AC[("activity_claims")]</w:t>
-      </w:r>
-      <w:r>
-        <w:br/>
-      </w:r>
-      <w:r>
-        <w:rPr>
-          <w:rStyle w:val="VerbatimChar"/>
-        </w:rPr>
-        <w:t xml:space="preserve">  KA --&gt; AC</w:t>
-      </w:r>
-      <w:r>
-        <w:br/>
-      </w:r>
-      <w:r>
-        <w:rPr>
-          <w:rStyle w:val="VerbatimChar"/>
-        </w:rPr>
-        <w:t xml:space="preserve">  AC --&gt; AGG["RecapAggregator\n(LIVE, tanpa snapshot)"]</w:t>
-      </w:r>
-      <w:r>
-        <w:br/>
-      </w:r>
-      <w:r>
-        <w:rPr>
-          <w:rStyle w:val="VerbatimChar"/>
-        </w:rPr>
-        <w:t xml:space="preserve">  AGG --&gt; TR["Rekap Tim Mingguan/Bulanan/Triwulanan"]</w:t>
-      </w:r>
-      <w:r>
-        <w:br/>
-      </w:r>
-      <w:r>
-        <w:rPr>
-          <w:rStyle w:val="VerbatimChar"/>
-        </w:rPr>
-        <w:t xml:space="preserve">  OVR[("recap_overrides\nparafrase")] --&gt; AGG</w:t>
-      </w:r>
-      <w:r>
-        <w:br/>
-      </w:r>
-      <w:r>
-        <w:rPr>
-          <w:rStyle w:val="VerbatimChar"/>
-        </w:rPr>
-        <w:t xml:space="preserve">  EVD[("team_recap_evidences\nNotula/Foto/DH")] --&gt; TR</w:t>
+        <w:pStyle w:val="FirstParagraph"/>
+      </w:pPr>
+      <w:r>
+        <w:drawing>
+          <wp:inline>
+            <wp:extent cx="5334000" cy="909554"/>
+            <wp:effectExtent b="0" l="0" r="0" t="0"/>
+            <wp:docPr descr="" title="" id="19" name="Picture"/>
+            <a:graphic>
+              <a:graphicData uri="http://schemas.openxmlformats.org/drawingml/2006/picture">
+                <pic:pic>
+                  <pic:nvPicPr>
+                    <pic:cNvPr descr="diagrams/rfc-002-as-is-2.png" id="20" name="Picture"/>
+                    <pic:cNvPicPr>
+                      <a:picLocks noChangeArrowheads="1" noChangeAspect="1"/>
+                    </pic:cNvPicPr>
+                  </pic:nvPicPr>
+                  <pic:blipFill>
+                    <a:blip r:embed="rId18"/>
+                    <a:stretch>
+                      <a:fillRect/>
+                    </a:stretch>
+                  </pic:blipFill>
+                  <pic:spPr bwMode="auto">
+                    <a:xfrm>
+                      <a:off x="0" y="0"/>
+                      <a:ext cx="5334000" cy="909554"/>
+                    </a:xfrm>
+                    <a:prstGeom prst="rect">
+                      <a:avLst/>
+                    </a:prstGeom>
+                    <a:noFill/>
+                    <a:ln w="9525">
+                      <a:noFill/>
+                      <a:headEnd/>
+                      <a:tailEnd/>
+                    </a:ln>
+                  </pic:spPr>
+                </pic:pic>
+              </a:graphicData>
+            </a:graphic>
+          </wp:inline>
+        </w:drawing>
       </w:r>
     </w:p>
     <w:p>
@@ -1757,8 +1667,8 @@
         <w:t xml:space="preserve">, refresh token. Lihat §3.3.</w:t>
       </w:r>
     </w:p>
-    <w:bookmarkEnd w:id="15"/>
-    <w:bookmarkStart w:id="16" w:name="domain-b-kinetik-integrasi-kipapp-baru"/>
+    <w:bookmarkEnd w:id="21"/>
+    <w:bookmarkStart w:id="22" w:name="domain-b-kinetik-integrasi-kipapp-baru"/>
     <w:p>
       <w:pPr>
         <w:pStyle w:val="Heading3"/>
@@ -2332,8 +2242,8 @@
         <w:t xml:space="preserve">(tanpa snapshot).</w:t>
       </w:r>
     </w:p>
-    <w:bookmarkEnd w:id="16"/>
-    <w:bookmarkStart w:id="17" w:name="Xef9f6e70d4221bddc2790f111d60c7edb156796"/>
+    <w:bookmarkEnd w:id="22"/>
+    <w:bookmarkStart w:id="23" w:name="Xef9f6e70d4221bddc2790f111d60c7edb156796"/>
     <w:p>
       <w:pPr>
         <w:pStyle w:val="Heading3"/>
@@ -2505,9 +2415,9 @@
         </w:pict>
       </w:r>
     </w:p>
-    <w:bookmarkEnd w:id="17"/>
-    <w:bookmarkEnd w:id="18"/>
-    <w:bookmarkStart w:id="20" w:name="X74fd94e41a03d3b88e4c55f86f6253fe644237c"/>
+    <w:bookmarkEnd w:id="23"/>
+    <w:bookmarkEnd w:id="24"/>
+    <w:bookmarkStart w:id="26" w:name="X74fd94e41a03d3b88e4c55f86f6253fe644237c"/>
     <w:p>
       <w:pPr>
         <w:pStyle w:val="Heading2"/>
@@ -2856,7 +2766,7 @@
         <w:t xml:space="preserve">.</w:t>
       </w:r>
     </w:p>
-    <w:bookmarkStart w:id="19" w:name="X6e15689036a25429290f27c9e6f3ead2f018955"/>
+    <w:bookmarkStart w:id="25" w:name="X6e15689036a25429290f27c9e6f3ead2f018955"/>
     <w:p>
       <w:pPr>
         <w:pStyle w:val="Heading3"/>
@@ -2998,9 +2908,9 @@
         </w:pict>
       </w:r>
     </w:p>
-    <w:bookmarkEnd w:id="19"/>
-    <w:bookmarkEnd w:id="20"/>
-    <w:bookmarkStart w:id="21" w:name="mengapa-desainnya-seperti-ini-rationale"/>
+    <w:bookmarkEnd w:id="25"/>
+    <w:bookmarkEnd w:id="26"/>
+    <w:bookmarkStart w:id="27" w:name="mengapa-desainnya-seperti-ini-rationale"/>
     <w:p>
       <w:pPr>
         <w:pStyle w:val="Heading2"/>
@@ -3477,8 +3387,8 @@
         </w:pict>
       </w:r>
     </w:p>
-    <w:bookmarkEnd w:id="21"/>
-    <w:bookmarkStart w:id="22" w:name="aktor-saat-ini-ringkas-detail-di-actors"/>
+    <w:bookmarkEnd w:id="27"/>
+    <w:bookmarkStart w:id="28" w:name="aktor-saat-ini-ringkas-detail-di-actors"/>
     <w:p>
       <w:pPr>
         <w:pStyle w:val="Heading2"/>
@@ -3943,8 +3853,8 @@
         </w:pict>
       </w:r>
     </w:p>
-    <w:bookmarkEnd w:id="22"/>
-    <w:bookmarkStart w:id="23" w:name="utang-risiko-yang-diketahui-jujur"/>
+    <w:bookmarkEnd w:id="28"/>
+    <w:bookmarkStart w:id="29" w:name="utang-risiko-yang-diketahui-jujur"/>
     <w:p>
       <w:pPr>
         <w:pStyle w:val="Heading2"/>
@@ -4189,8 +4099,8 @@
         </w:pict>
       </w:r>
     </w:p>
-    <w:bookmarkEnd w:id="23"/>
-    <w:bookmarkStart w:id="24" w:name="apa-yang-dipakai-sebagai-dasar-rfc-003"/>
+    <w:bookmarkEnd w:id="29"/>
+    <w:bookmarkStart w:id="30" w:name="apa-yang-dipakai-sebagai-dasar-rfc-003"/>
     <w:p>
       <w:pPr>
         <w:pStyle w:val="Heading2"/>
@@ -4307,8 +4217,8 @@
         <w:t xml:space="preserve">.</w:t>
       </w:r>
     </w:p>
-    <w:bookmarkEnd w:id="24"/>
-    <w:bookmarkEnd w:id="25"/>
+    <w:bookmarkEnd w:id="30"/>
+    <w:bookmarkEnd w:id="31"/>
     <w:sectPr>
       <w:footnotePr>
         <w:numRestart w:val="eachSect"/>
@@ -5222,14 +5132,6 @@
     <w:unhideWhenUsed/>
     <w:qFormat/>
     <w:tblPr>
-      <w:tblBorders>
-        <w:top w:color="999999" w:space="0" w:sz="4" w:val="single"/>
-        <w:left w:color="999999" w:space="0" w:sz="4" w:val="single"/>
-        <w:bottom w:color="999999" w:space="0" w:sz="4" w:val="single"/>
-        <w:right w:color="999999" w:space="0" w:sz="4" w:val="single"/>
-        <w:insideH w:color="999999" w:space="0" w:sz="4" w:val="single"/>
-        <w:insideV w:color="999999" w:space="0" w:sz="4" w:val="single"/>
-      </w:tblBorders>
       <w:tblInd w:type="dxa" w:w="0"/>
       <w:tblCellMar>
         <w:top w:type="dxa" w:w="0"/>

</xml_diff>